<commit_message>
docs: regenerate con imagenes robustez PNG + tablas seed data/data types/endpoints
- Reemplazados 4 diagramas de robustez (Mermaid.js -> PNG generados por IA)
- INFORME_MICROSERVICIOS_SISEXP.md: tablas Seed Data, Data Types, 44 endpoints,
  seccion Railway, Diagrama de Despliegue (despliegue.png)
- INFORME_COMPLETO_SISEXP.md + ICONIX: actualizados
- per-service docs: robustez, secuencia, clases imagenes actualizadas
- README: Dashboard year filter + new robustness images
- DiagramasTab.js: soporte type:'image' para diagramas PNG
- DCX regenerados con pandoc + reference.docx (imagenes incluidas)
- Frontend deploy Vercel: https://frontend-ivory-nine-43.vercel.app
</commit_message>
<xml_diff>
--- a/docs/ICONIX_ARQUITECTURA_GLOBAL.docx
+++ b/docs/ICONIX_ARQUITECTURA_GLOBAL.docx
@@ -26,6 +26,32 @@
         <w:t xml:space="preserve">Arquitectura de Software — VIII Ciclo — Julio 2026</w:t>
       </w:r>
     </w:p>
+    <w:sdt>
+      <w:sdtPr>
+        <w:docPartObj>
+          <w:docPartGallery w:val="Table of Contents"/>
+          <w:docPartUnique/>
+        </w:docPartObj>
+      </w:sdtPr>
+      <w:sdtContent>
+        <w:p>
+          <w:pPr>
+            <w:pStyle w:val="TOCHeading"/>
+          </w:pPr>
+          <w:r>
+            <w:t xml:space="preserve">Table of Contents</w:t>
+          </w:r>
+        </w:p>
+        <w:p>
+          <w:r>
+            <w:fldChar w:fldCharType="begin" w:dirty="true"/>
+            <w:instrText xml:space="preserve">TOC \o "1-3" \h \z \u</w:instrText>
+            <w:fldChar w:fldCharType="separate"/>
+            <w:fldChar w:fldCharType="end"/>
+          </w:r>
+        </w:p>
+      </w:sdtContent>
+    </w:sdt>
     <w:bookmarkStart w:id="32" w:name="sisexp-upla-arquitectura-global"/>
     <w:p>
       <w:pPr>

</xml_diff>